<commit_message>
feat: Projeto-Algoritmo-1-V2.docx completo — proposta + fluxograma + molde UFRB
</commit_message>
<xml_diff>
--- a/disciplinas/gcetens843-projeto-algoritmo-i/atividades/trabalhos/projeto-algoritmos/Projeto-Algoritmo-1-V2.docx
+++ b/disciplinas/gcetens843-projeto-algoritmo-i/atividades/trabalhos/projeto-algoritmos/Projeto-Algoritmo-1-V2.docx
@@ -2979,57 +2979,6 @@
     <w:p>
       <w:pPr>
         <w:spacing w:after="0" w:line="360" w:lineRule="auto"/>
-        <w:ind w:firstLine="708"/>
-        <w:jc w:val="both"/>
-        <w:rPr>
-          <w:rFonts w:ascii="Arial" w:hAnsi="Arial" w:cs="Arial"/>
-          <w:color w:val="FF0000"/>
-          <w:sz w:val="24"/>
-          <w:szCs w:val="24"/>
-        </w:rPr>
-      </w:pPr>
-      <w:proofErr w:type="gramStart"/>
-      <w:r>
-        <w:rPr>
-          <w:rFonts w:ascii="Arial" w:hAnsi="Arial" w:cs="Arial"/>
-          <w:color w:val="FF0000"/>
-          <w:sz w:val="24"/>
-          <w:szCs w:val="24"/>
-        </w:rPr>
-        <w:t>[</w:t>
-      </w:r>
-      <w:r>
-        <w:rPr>
-          <w:rFonts w:ascii="Arial" w:hAnsi="Arial" w:cs="Arial"/>
-          <w:color w:val="FF0000"/>
-          <w:sz w:val="24"/>
-          <w:szCs w:val="24"/>
-        </w:rPr>
-        <w:t>Abordar</w:t>
-      </w:r>
-      <w:proofErr w:type="gramEnd"/>
-      <w:r>
-        <w:rPr>
-          <w:rFonts w:ascii="Arial" w:hAnsi="Arial" w:cs="Arial"/>
-          <w:color w:val="FF0000"/>
-          <w:sz w:val="24"/>
-          <w:szCs w:val="24"/>
-        </w:rPr>
-        <w:t xml:space="preserve"> sobre a solução</w:t>
-      </w:r>
-      <w:r>
-        <w:rPr>
-          <w:rFonts w:ascii="Arial" w:hAnsi="Arial" w:cs="Arial"/>
-          <w:color w:val="FF0000"/>
-          <w:sz w:val="24"/>
-          <w:szCs w:val="24"/>
-        </w:rPr>
-        <w:t>]</w:t>
-      </w:r>
-    </w:p>
-    <w:p>
-      <w:pPr>
-        <w:spacing w:after="0" w:line="360" w:lineRule="auto"/>
         <w:jc w:val="both"/>
         <w:rPr>
           <w:rFonts w:ascii="Arial" w:hAnsi="Arial" w:cs="Arial"/>
@@ -3115,71 +3064,17 @@
         <w:jc w:val="both"/>
         <w:rPr>
           <w:rFonts w:ascii="Arial" w:hAnsi="Arial" w:cs="Arial"/>
-          <w:color w:val="FF0000"/>
-          <w:sz w:val="24"/>
-          <w:szCs w:val="24"/>
-        </w:rPr>
-      </w:pPr>
-      <w:proofErr w:type="gramStart"/>
-      <w:r>
-        <w:rPr>
-          <w:rFonts w:ascii="Arial" w:hAnsi="Arial" w:cs="Arial"/>
-          <w:color w:val="FF0000"/>
-          <w:sz w:val="24"/>
-          <w:szCs w:val="24"/>
-        </w:rPr>
-        <w:t>[Inserir</w:t>
-      </w:r>
-      <w:proofErr w:type="gramEnd"/>
-      <w:r>
-        <w:rPr>
-          <w:rFonts w:ascii="Arial" w:hAnsi="Arial" w:cs="Arial"/>
-          <w:color w:val="FF0000"/>
-          <w:sz w:val="24"/>
-          <w:szCs w:val="24"/>
-        </w:rPr>
-        <w:t xml:space="preserve"> figura]</w:t>
-      </w:r>
-    </w:p>
-    <w:p>
-      <w:pPr>
-        <w:spacing w:after="0" w:line="360" w:lineRule="auto"/>
-        <w:ind w:firstLine="708"/>
-        <w:jc w:val="both"/>
-        <w:rPr>
-          <w:rFonts w:ascii="Arial" w:hAnsi="Arial" w:cs="Arial"/>
-          <w:sz w:val="24"/>
-          <w:szCs w:val="24"/>
-        </w:rPr>
-      </w:pPr>
-      <w:r>
-        <w:rPr>
-          <w:rFonts w:ascii="Arial" w:hAnsi="Arial" w:cs="Arial"/>
-          <w:sz w:val="24"/>
-          <w:szCs w:val="24"/>
-        </w:rPr>
-        <w:t xml:space="preserve"> </w:t>
-      </w:r>
-    </w:p>
-    <w:p>
-      <w:pPr>
-        <w:spacing w:after="0" w:line="360" w:lineRule="auto"/>
-        <w:jc w:val="both"/>
-        <w:rPr>
-          <w:rFonts w:ascii="Arial" w:hAnsi="Arial" w:cs="Arial"/>
-          <w:b/>
-          <w:sz w:val="24"/>
-          <w:szCs w:val="24"/>
-        </w:rPr>
-      </w:pPr>
-      <w:r>
-        <w:rPr>
-          <w:rFonts w:ascii="Arial" w:hAnsi="Arial" w:cs="Arial"/>
-          <w:b/>
-          <w:sz w:val="24"/>
-          <w:szCs w:val="24"/>
-        </w:rPr>
-        <w:t>3.2 Telas de protótipo</w:t>
+          <w:sz w:val="24"/>
+          <w:szCs w:val="24"/>
+        </w:rPr>
+      </w:pPr>
+      <w:r>
+        <w:rPr>
+          <w:rFonts w:ascii="Arial" w:hAnsi="Arial" w:cs="Arial"/>
+          <w:sz w:val="24"/>
+          <w:szCs w:val="24"/>
+        </w:rPr>
+        <w:t xml:space="preserve"> </w:t>
       </w:r>
     </w:p>
     <w:p>
@@ -6449,7 +6344,1761 @@
         <w:t>. Acesso em: 28 jun. 2026.</w:t>
       </w:r>
     </w:p>
+    <w:p>
+      <w:pPr>
+        <w:jc w:val="center"/>
+      </w:pPr>
+      <w:r>
+        <w:drawing>
+          <wp:inline xmlns:a="http://schemas.openxmlformats.org/drawingml/2006/main" xmlns:pic="http://schemas.openxmlformats.org/drawingml/2006/picture">
+            <wp:extent cx="4572000" cy="9661947"/>
+            <wp:docPr id="1" name="Picture 1"/>
+            <wp:cNvGraphicFramePr>
+              <a:graphicFrameLocks noChangeAspect="1"/>
+            </wp:cNvGraphicFramePr>
+            <a:graphic>
+              <a:graphicData uri="http://schemas.openxmlformats.org/drawingml/2006/picture">
+                <pic:pic>
+                  <pic:nvPicPr>
+                    <pic:cNvPr id="0" name="fluxograma.jpeg"/>
+                    <pic:cNvPicPr/>
+                  </pic:nvPicPr>
+                  <pic:blipFill>
+                    <a:blip r:embed="rId24"/>
+                    <a:stretch>
+                      <a:fillRect/>
+                    </a:stretch>
+                  </pic:blipFill>
+                  <pic:spPr>
+                    <a:xfrm>
+                      <a:off x="0" y="0"/>
+                      <a:ext cx="4572000" cy="9661947"/>
+                    </a:xfrm>
+                    <a:prstGeom prst="rect"/>
+                  </pic:spPr>
+                </pic:pic>
+              </a:graphicData>
+            </a:graphic>
+          </wp:inline>
+        </w:drawing>
+      </w:r>
+    </w:p>
+    <w:p>
+      <w:pPr>
+        <w:spacing w:line="320" w:lineRule="exact" w:after="80"/>
+      </w:pPr>
+      <w:r>
+        <w:rPr>
+          <w:rFonts w:ascii="Times New Roman" w:hAnsi="Times New Roman"/>
+          <w:sz w:val="22"/>
+        </w:rPr>
+        <w:t>## 1. Identificação</w:t>
+      </w:r>
+    </w:p>
+    <w:p>
+      <w:pPr>
+        <w:spacing w:line="320" w:lineRule="exact" w:after="80"/>
+      </w:pPr>
+      <w:r>
+        <w:rPr>
+          <w:rFonts w:ascii="Times New Roman" w:hAnsi="Times New Roman"/>
+          <w:sz w:val="22"/>
+        </w:rPr>
+        <w:t>| Item | Descrição |</w:t>
+      </w:r>
+    </w:p>
+    <w:p>
+      <w:pPr>
+        <w:spacing w:line="320" w:lineRule="exact" w:after="80"/>
+      </w:pPr>
+      <w:r>
+        <w:rPr>
+          <w:rFonts w:ascii="Times New Roman" w:hAnsi="Times New Roman"/>
+          <w:sz w:val="22"/>
+        </w:rPr>
+        <w:t>|------|-----------|</w:t>
+      </w:r>
+    </w:p>
+    <w:p>
+      <w:pPr>
+        <w:spacing w:line="320" w:lineRule="exact" w:after="80"/>
+      </w:pPr>
+      <w:r>
+        <w:rPr>
+          <w:rFonts w:ascii="Times New Roman" w:hAnsi="Times New Roman"/>
+          <w:sz w:val="22"/>
+        </w:rPr>
+        <w:t>| Nome do Projeto | MinhaFila |</w:t>
+      </w:r>
+    </w:p>
+    <w:p>
+      <w:pPr>
+        <w:spacing w:line="320" w:lineRule="exact" w:after="80"/>
+      </w:pPr>
+      <w:r>
+        <w:rPr>
+          <w:rFonts w:ascii="Times New Roman" w:hAnsi="Times New Roman"/>
+          <w:sz w:val="22"/>
+        </w:rPr>
+        <w:t>| Tema | Gerenciamento Inteligente de Filas para Múltiplos Setores |</w:t>
+      </w:r>
+    </w:p>
+    <w:p>
+      <w:pPr>
+        <w:spacing w:line="320" w:lineRule="exact" w:after="80"/>
+      </w:pPr>
+      <w:r>
+        <w:rPr>
+          <w:rFonts w:ascii="Times New Roman" w:hAnsi="Times New Roman"/>
+          <w:sz w:val="22"/>
+        </w:rPr>
+        <w:t>| Disciplina | GCETENS843 — Projeto Algoritmo I |</w:t>
+      </w:r>
+    </w:p>
+    <w:p>
+      <w:pPr>
+        <w:spacing w:line="320" w:lineRule="exact" w:after="80"/>
+      </w:pPr>
+      <w:r>
+        <w:rPr>
+          <w:rFonts w:ascii="Times New Roman" w:hAnsi="Times New Roman"/>
+          <w:sz w:val="22"/>
+        </w:rPr>
+        <w:t>| Instituição | UFRB — CETENS — Bacharelado em Sistemas de Informação (EAD) |</w:t>
+      </w:r>
+    </w:p>
+    <w:p>
+      <w:pPr>
+        <w:spacing w:line="320" w:lineRule="exact" w:after="80"/>
+      </w:pPr>
+      <w:r>
+        <w:rPr>
+          <w:rFonts w:ascii="Times New Roman" w:hAnsi="Times New Roman"/>
+          <w:sz w:val="22"/>
+        </w:rPr>
+        <w:t>## 2. O Problema</w:t>
+      </w:r>
+    </w:p>
+    <w:p>
+      <w:pPr>
+        <w:spacing w:line="320" w:lineRule="exact" w:after="80"/>
+      </w:pPr>
+      <w:r>
+        <w:rPr>
+          <w:rFonts w:ascii="Times New Roman" w:hAnsi="Times New Roman"/>
+          <w:sz w:val="22"/>
+        </w:rPr>
+        <w:t>Filas presenciais são uma realidade comum em bancos, hospitais, faculdades, comércios e repartições públicas. Em todos esses setores, o funcionamento é similar:</w:t>
+      </w:r>
+    </w:p>
+    <w:p>
+      <w:pPr>
+        <w:spacing w:line="320" w:lineRule="exact" w:after="80"/>
+      </w:pPr>
+      <w:r>
+        <w:rPr>
+          <w:rFonts w:ascii="Times New Roman" w:hAnsi="Times New Roman"/>
+          <w:sz w:val="22"/>
+        </w:rPr>
+        <w:t>1. O usuário chega ao local, dirige-se a um guichê e recebe uma senha física (ordem de chegada).</w:t>
+      </w:r>
+    </w:p>
+    <w:p>
+      <w:pPr>
+        <w:spacing w:line="320" w:lineRule="exact" w:after="80"/>
+      </w:pPr>
+      <w:r>
+        <w:rPr>
+          <w:rFonts w:ascii="Times New Roman" w:hAnsi="Times New Roman"/>
+          <w:sz w:val="22"/>
+        </w:rPr>
+        <w:t>2. Permanece no local aguardando ser chamado, sem saber quantas pessoas estão à sua frente.</w:t>
+      </w:r>
+    </w:p>
+    <w:p>
+      <w:pPr>
+        <w:spacing w:line="320" w:lineRule="exact" w:after="80"/>
+      </w:pPr>
+      <w:r>
+        <w:rPr>
+          <w:rFonts w:ascii="Times New Roman" w:hAnsi="Times New Roman"/>
+          <w:sz w:val="22"/>
+        </w:rPr>
+        <w:t>3. Depende de chamadas por alto-falante ou painéis com códigos de difícil compreensão.</w:t>
+      </w:r>
+    </w:p>
+    <w:p>
+      <w:pPr>
+        <w:spacing w:line="320" w:lineRule="exact" w:after="80"/>
+      </w:pPr>
+      <w:r>
+        <w:rPr>
+          <w:rFonts w:ascii="Times New Roman" w:hAnsi="Times New Roman"/>
+          <w:sz w:val="22"/>
+        </w:rPr>
+        <w:t>4. Não tem visibilidade do tempo estimado de espera nem da sua posição atual.</w:t>
+      </w:r>
+    </w:p>
+    <w:p>
+      <w:pPr>
+        <w:spacing w:line="320" w:lineRule="exact" w:after="80"/>
+      </w:pPr>
+      <w:r>
+        <w:rPr>
+          <w:rFonts w:ascii="Times New Roman" w:hAnsi="Times New Roman"/>
+          <w:sz w:val="22"/>
+        </w:rPr>
+        <w:t>5. Não pode se ausentar do local com segurança — corre o risco de perder a vez.</w:t>
+      </w:r>
+    </w:p>
+    <w:p>
+      <w:pPr>
+        <w:spacing w:line="320" w:lineRule="exact" w:after="80"/>
+      </w:pPr>
+      <w:r>
+        <w:rPr>
+          <w:rFonts w:ascii="Times New Roman" w:hAnsi="Times New Roman"/>
+          <w:sz w:val="22"/>
+        </w:rPr>
+        <w:t>6. Pessoas com deficiência auditiva perdem chamadas sonoras; pessoas com baixa visão têm dificuldade para ler painéis; pessoas com TEA sofrem com o excesso de estímulos em ambientes lotados.</w:t>
+      </w:r>
+    </w:p>
+    <w:p>
+      <w:pPr>
+        <w:spacing w:line="320" w:lineRule="exact" w:after="80"/>
+      </w:pPr>
+      <w:r>
+        <w:rPr>
+          <w:rFonts w:ascii="Times New Roman" w:hAnsi="Times New Roman"/>
+          <w:sz w:val="22"/>
+        </w:rPr>
+        <w:t>Consequências observadas:</w:t>
+      </w:r>
+    </w:p>
+    <w:p>
+      <w:pPr>
+        <w:spacing w:line="320" w:lineRule="exact" w:after="80"/>
+      </w:pPr>
+      <w:r>
+        <w:rPr>
+          <w:rFonts w:ascii="Times New Roman" w:hAnsi="Times New Roman"/>
+          <w:sz w:val="22"/>
+        </w:rPr>
+        <w:t xml:space="preserve">  • Sensação de injustiça e opacidade no atendimento</w:t>
+      </w:r>
+    </w:p>
+    <w:p>
+      <w:pPr>
+        <w:spacing w:line="320" w:lineRule="exact" w:after="80"/>
+      </w:pPr>
+      <w:r>
+        <w:rPr>
+          <w:rFonts w:ascii="Times New Roman" w:hAnsi="Times New Roman"/>
+          <w:sz w:val="22"/>
+        </w:rPr>
+        <w:t xml:space="preserve">  • Ansiedade gerada pela imprevisibilidade da espera</w:t>
+      </w:r>
+    </w:p>
+    <w:p>
+      <w:pPr>
+        <w:spacing w:line="320" w:lineRule="exact" w:after="80"/>
+      </w:pPr>
+      <w:r>
+        <w:rPr>
+          <w:rFonts w:ascii="Times New Roman" w:hAnsi="Times New Roman"/>
+          <w:sz w:val="22"/>
+        </w:rPr>
+        <w:t xml:space="preserve">  • Aglomeração desnecessária nas áreas de espera</w:t>
+      </w:r>
+    </w:p>
+    <w:p>
+      <w:pPr>
+        <w:spacing w:line="320" w:lineRule="exact" w:after="80"/>
+      </w:pPr>
+      <w:r>
+        <w:rPr>
+          <w:rFonts w:ascii="Times New Roman" w:hAnsi="Times New Roman"/>
+          <w:sz w:val="22"/>
+        </w:rPr>
+        <w:t xml:space="preserve">  • Desistência e absenteísmo</w:t>
+      </w:r>
+    </w:p>
+    <w:p>
+      <w:pPr>
+        <w:spacing w:line="320" w:lineRule="exact" w:after="80"/>
+      </w:pPr>
+      <w:r>
+        <w:rPr>
+          <w:rFonts w:ascii="Times New Roman" w:hAnsi="Times New Roman"/>
+          <w:sz w:val="22"/>
+        </w:rPr>
+        <w:t xml:space="preserve">  • Experiência negativa independentemente da qualidade do serviço prestado</w:t>
+      </w:r>
+    </w:p>
+    <w:p>
+      <w:pPr>
+        <w:spacing w:line="320" w:lineRule="exact" w:after="80"/>
+      </w:pPr>
+      <w:r>
+        <w:rPr>
+          <w:rFonts w:ascii="Times New Roman" w:hAnsi="Times New Roman"/>
+          <w:sz w:val="22"/>
+        </w:rPr>
+        <w:t xml:space="preserve">  • Exclusão de pessoas com deficiência que não conseguem acompanhar o sistema tradicional</w:t>
+      </w:r>
+    </w:p>
+    <w:p>
+      <w:pPr>
+        <w:spacing w:line="320" w:lineRule="exact" w:after="80"/>
+      </w:pPr>
+      <w:r>
+        <w:rPr>
+          <w:rFonts w:ascii="Times New Roman" w:hAnsi="Times New Roman"/>
+          <w:sz w:val="22"/>
+        </w:rPr>
+        <w:t>Problemas existentes nas soluções atuais:</w:t>
+      </w:r>
+    </w:p>
+    <w:p>
+      <w:pPr>
+        <w:spacing w:line="320" w:lineRule="exact" w:after="80"/>
+      </w:pPr>
+      <w:r>
+        <w:rPr>
+          <w:rFonts w:ascii="Times New Roman" w:hAnsi="Times New Roman"/>
+          <w:sz w:val="22"/>
+        </w:rPr>
+        <w:t xml:space="preserve">  • Sistemas de senha física não fornecem informações em tempo real</w:t>
+      </w:r>
+    </w:p>
+    <w:p>
+      <w:pPr>
+        <w:spacing w:line="320" w:lineRule="exact" w:after="80"/>
+      </w:pPr>
+      <w:r>
+        <w:rPr>
+          <w:rFonts w:ascii="Times New Roman" w:hAnsi="Times New Roman"/>
+          <w:sz w:val="22"/>
+        </w:rPr>
+        <w:t xml:space="preserve">  • Painéis eletrônicos têm alcance limitado e não são acessíveis</w:t>
+      </w:r>
+    </w:p>
+    <w:p>
+      <w:pPr>
+        <w:spacing w:line="320" w:lineRule="exact" w:after="80"/>
+      </w:pPr>
+      <w:r>
+        <w:rPr>
+          <w:rFonts w:ascii="Times New Roman" w:hAnsi="Times New Roman"/>
+          <w:sz w:val="22"/>
+        </w:rPr>
+        <w:t xml:space="preserve">  • Aplicativos existentes são setoriais (funcionam apenas para saúde ou apenas para bancos)</w:t>
+      </w:r>
+    </w:p>
+    <w:p>
+      <w:pPr>
+        <w:spacing w:line="320" w:lineRule="exact" w:after="80"/>
+      </w:pPr>
+      <w:r>
+        <w:rPr>
+          <w:rFonts w:ascii="Times New Roman" w:hAnsi="Times New Roman"/>
+          <w:sz w:val="22"/>
+        </w:rPr>
+        <w:t xml:space="preserve">  • Nenhuma solução popular permite que o usuário aguarde fora do local com segurança</w:t>
+      </w:r>
+    </w:p>
+    <w:p>
+      <w:pPr>
+        <w:spacing w:line="320" w:lineRule="exact" w:after="80"/>
+      </w:pPr>
+      <w:r>
+        <w:rPr>
+          <w:rFonts w:ascii="Times New Roman" w:hAnsi="Times New Roman"/>
+          <w:sz w:val="22"/>
+        </w:rPr>
+        <w:t>## 3. A Solução</w:t>
+      </w:r>
+    </w:p>
+    <w:p>
+      <w:pPr>
+        <w:spacing w:line="320" w:lineRule="exact" w:after="80"/>
+      </w:pPr>
+      <w:r>
+        <w:rPr>
+          <w:rFonts w:ascii="Times New Roman" w:hAnsi="Times New Roman"/>
+          <w:sz w:val="22"/>
+        </w:rPr>
+        <w:t>O MinhaFila é um sistema de senha virtual com acompanhamento em tempo real, notificações e painéis de gestão, projetado para funcionar em múltiplos setores: bancos, unidades de saúde, instituições de ensino, comércio e repartições governamentais.</w:t>
+      </w:r>
+    </w:p>
+    <w:p>
+      <w:pPr>
+        <w:spacing w:line="320" w:lineRule="exact" w:after="80"/>
+      </w:pPr>
+      <w:r>
+        <w:rPr>
+          <w:rFonts w:ascii="Times New Roman" w:hAnsi="Times New Roman"/>
+          <w:sz w:val="22"/>
+        </w:rPr>
+        <w:t>### Conceito Central</w:t>
+      </w:r>
+    </w:p>
+    <w:p>
+      <w:pPr>
+        <w:spacing w:line="320" w:lineRule="exact" w:after="80"/>
+      </w:pPr>
+      <w:r>
+        <w:rPr>
+          <w:rFonts w:ascii="Times New Roman" w:hAnsi="Times New Roman"/>
+          <w:sz w:val="22"/>
+        </w:rPr>
+        <w:t>O usuário chega ao local, realiza um cadastro rápido e recebe uma senha virtual diretamente no celular. A partir daí, acompanha sua posição na fila, o tempo estimado de espera e recebe notificações quando estiver próximo de ser chamado — tudo pelo próprio dispositivo.</w:t>
+      </w:r>
+    </w:p>
+    <w:p>
+      <w:pPr>
+        <w:spacing w:line="320" w:lineRule="exact" w:after="80"/>
+      </w:pPr>
+      <w:r>
+        <w:rPr>
+          <w:rFonts w:ascii="Times New Roman" w:hAnsi="Times New Roman"/>
+          <w:sz w:val="22"/>
+        </w:rPr>
+        <w:t>### Como Funciona na Prática</w:t>
+      </w:r>
+    </w:p>
+    <w:p>
+      <w:pPr>
+        <w:spacing w:line="320" w:lineRule="exact" w:after="80"/>
+      </w:pPr>
+      <w:r>
+        <w:rPr>
+          <w:rFonts w:ascii="Times New Roman" w:hAnsi="Times New Roman"/>
+          <w:sz w:val="22"/>
+        </w:rPr>
+        <w:t>1. Chegada — O usuário abre o app ou escaneia um QR Code na recepção.</w:t>
+      </w:r>
+    </w:p>
+    <w:p>
+      <w:pPr>
+        <w:spacing w:line="320" w:lineRule="exact" w:after="80"/>
+      </w:pPr>
+      <w:r>
+        <w:rPr>
+          <w:rFonts w:ascii="Times New Roman" w:hAnsi="Times New Roman"/>
+          <w:sz w:val="22"/>
+        </w:rPr>
+        <w:t>2. Cadastro rápido — Informa nome, telefone e o serviço desejado (opcionalmente, necessidades de acessibilidade).</w:t>
+      </w:r>
+    </w:p>
+    <w:p>
+      <w:pPr>
+        <w:spacing w:line="320" w:lineRule="exact" w:after="80"/>
+      </w:pPr>
+      <w:r>
+        <w:rPr>
+          <w:rFonts w:ascii="Times New Roman" w:hAnsi="Times New Roman"/>
+          <w:sz w:val="22"/>
+        </w:rPr>
+        <w:t>3. Senha virtual — Recebe imediatamente uma senha e entra na fila.</w:t>
+      </w:r>
+    </w:p>
+    <w:p>
+      <w:pPr>
+        <w:spacing w:line="320" w:lineRule="exact" w:after="80"/>
+      </w:pPr>
+      <w:r>
+        <w:rPr>
+          <w:rFonts w:ascii="Times New Roman" w:hAnsi="Times New Roman"/>
+          <w:sz w:val="22"/>
+        </w:rPr>
+        <w:t>4. Acompanhamento — Visualiza no celular:</w:t>
+      </w:r>
+    </w:p>
+    <w:p>
+      <w:pPr>
+        <w:spacing w:line="320" w:lineRule="exact" w:after="80"/>
+      </w:pPr>
+      <w:r>
+        <w:rPr>
+          <w:rFonts w:ascii="Times New Roman" w:hAnsi="Times New Roman"/>
+          <w:sz w:val="22"/>
+        </w:rPr>
+        <w:t xml:space="preserve">  • "Sua posição: 7º lugar"</w:t>
+      </w:r>
+    </w:p>
+    <w:p>
+      <w:pPr>
+        <w:spacing w:line="320" w:lineRule="exact" w:after="80"/>
+      </w:pPr>
+      <w:r>
+        <w:rPr>
+          <w:rFonts w:ascii="Times New Roman" w:hAnsi="Times New Roman"/>
+          <w:sz w:val="22"/>
+        </w:rPr>
+        <w:t xml:space="preserve">  • "Tempo estimado: 25 minutos"</w:t>
+      </w:r>
+    </w:p>
+    <w:p>
+      <w:pPr>
+        <w:spacing w:line="320" w:lineRule="exact" w:after="80"/>
+      </w:pPr>
+      <w:r>
+        <w:rPr>
+          <w:rFonts w:ascii="Times New Roman" w:hAnsi="Times New Roman"/>
+          <w:sz w:val="22"/>
+        </w:rPr>
+        <w:t xml:space="preserve">  • Quantidade de pessoas à frente por categoria/serviço</w:t>
+      </w:r>
+    </w:p>
+    <w:p>
+      <w:pPr>
+        <w:spacing w:line="320" w:lineRule="exact" w:after="80"/>
+      </w:pPr>
+      <w:r>
+        <w:rPr>
+          <w:rFonts w:ascii="Times New Roman" w:hAnsi="Times New Roman"/>
+          <w:sz w:val="22"/>
+        </w:rPr>
+        <w:t>5. Notificação — Recebe alerta quando estiver próximo de ser chamado (push, vibração, som).</w:t>
+      </w:r>
+    </w:p>
+    <w:p>
+      <w:pPr>
+        <w:spacing w:line="320" w:lineRule="exact" w:after="80"/>
+      </w:pPr>
+      <w:r>
+        <w:rPr>
+          <w:rFonts w:ascii="Times New Roman" w:hAnsi="Times New Roman"/>
+          <w:sz w:val="22"/>
+        </w:rPr>
+        <w:t>6. Atendimento — Dirige-se ao guichê indicado quando for sua vez.</w:t>
+      </w:r>
+    </w:p>
+    <w:p>
+      <w:pPr>
+        <w:spacing w:line="320" w:lineRule="exact" w:after="80"/>
+      </w:pPr>
+      <w:r>
+        <w:rPr>
+          <w:rFonts w:ascii="Times New Roman" w:hAnsi="Times New Roman"/>
+          <w:sz w:val="22"/>
+        </w:rPr>
+        <w:t>### Jornada do Gestor (Painel Administrativo)</w:t>
+      </w:r>
+    </w:p>
+    <w:p>
+      <w:pPr>
+        <w:spacing w:line="320" w:lineRule="exact" w:after="80"/>
+      </w:pPr>
+      <w:r>
+        <w:rPr>
+          <w:rFonts w:ascii="Times New Roman" w:hAnsi="Times New Roman"/>
+          <w:sz w:val="22"/>
+        </w:rPr>
+        <w:t>1. Visualiza a fila em tempo real com todas as senhas ativas.</w:t>
+      </w:r>
+    </w:p>
+    <w:p>
+      <w:pPr>
+        <w:spacing w:line="320" w:lineRule="exact" w:after="80"/>
+      </w:pPr>
+      <w:r>
+        <w:rPr>
+          <w:rFonts w:ascii="Times New Roman" w:hAnsi="Times New Roman"/>
+          <w:sz w:val="22"/>
+        </w:rPr>
+        <w:t>2. Gerencia múltiplos guichês e serviços simultaneamente.</w:t>
+      </w:r>
+    </w:p>
+    <w:p>
+      <w:pPr>
+        <w:spacing w:line="320" w:lineRule="exact" w:after="80"/>
+      </w:pPr>
+      <w:r>
+        <w:rPr>
+          <w:rFonts w:ascii="Times New Roman" w:hAnsi="Times New Roman"/>
+          <w:sz w:val="22"/>
+        </w:rPr>
+        <w:t>3. Chama o próximo usuário com um clique.</w:t>
+      </w:r>
+    </w:p>
+    <w:p>
+      <w:pPr>
+        <w:spacing w:line="320" w:lineRule="exact" w:after="80"/>
+      </w:pPr>
+      <w:r>
+        <w:rPr>
+          <w:rFonts w:ascii="Times New Roman" w:hAnsi="Times New Roman"/>
+          <w:sz w:val="22"/>
+        </w:rPr>
+        <w:t>4. Acessa histórico de atendimentos e relatórios analíticos.</w:t>
+      </w:r>
+    </w:p>
+    <w:p>
+      <w:pPr>
+        <w:spacing w:line="320" w:lineRule="exact" w:after="80"/>
+      </w:pPr>
+      <w:r>
+        <w:rPr>
+          <w:rFonts w:ascii="Times New Roman" w:hAnsi="Times New Roman"/>
+          <w:sz w:val="22"/>
+        </w:rPr>
+        <w:t>5. Configura horários de pico, capacidade e regras de prioridade.</w:t>
+      </w:r>
+    </w:p>
+    <w:p>
+      <w:pPr>
+        <w:spacing w:line="320" w:lineRule="exact" w:after="80"/>
+      </w:pPr>
+      <w:r>
+        <w:rPr>
+          <w:rFonts w:ascii="Times New Roman" w:hAnsi="Times New Roman"/>
+          <w:sz w:val="22"/>
+        </w:rPr>
+        <w:t>## 4. Diferenciais</w:t>
+      </w:r>
+    </w:p>
+    <w:p>
+      <w:pPr>
+        <w:spacing w:line="320" w:lineRule="exact" w:after="80"/>
+      </w:pPr>
+      <w:r>
+        <w:rPr>
+          <w:rFonts w:ascii="Times New Roman" w:hAnsi="Times New Roman"/>
+          <w:sz w:val="22"/>
+        </w:rPr>
+        <w:t>| Diferencial | Descrição |</w:t>
+      </w:r>
+    </w:p>
+    <w:p>
+      <w:pPr>
+        <w:spacing w:line="320" w:lineRule="exact" w:after="80"/>
+      </w:pPr>
+      <w:r>
+        <w:rPr>
+          <w:rFonts w:ascii="Times New Roman" w:hAnsi="Times New Roman"/>
+          <w:sz w:val="22"/>
+        </w:rPr>
+        <w:t>|-------------|-----------|</w:t>
+      </w:r>
+    </w:p>
+    <w:p>
+      <w:pPr>
+        <w:spacing w:line="320" w:lineRule="exact" w:after="80"/>
+      </w:pPr>
+      <w:r>
+        <w:rPr>
+          <w:rFonts w:ascii="Times New Roman" w:hAnsi="Times New Roman"/>
+          <w:sz w:val="22"/>
+        </w:rPr>
+        <w:t>| Transparência | O usuário vê exatamente sua posição e o tempo estimado, eliminando a sensação de injustiça |</w:t>
+      </w:r>
+    </w:p>
+    <w:p>
+      <w:pPr>
+        <w:spacing w:line="320" w:lineRule="exact" w:after="80"/>
+      </w:pPr>
+      <w:r>
+        <w:rPr>
+          <w:rFonts w:ascii="Times New Roman" w:hAnsi="Times New Roman"/>
+          <w:sz w:val="22"/>
+        </w:rPr>
+        <w:t>| Mobilidade | O usuário pode aguardar fora do local e ser notificado quando estiver próximo |</w:t>
+      </w:r>
+    </w:p>
+    <w:p>
+      <w:pPr>
+        <w:spacing w:line="320" w:lineRule="exact" w:after="80"/>
+      </w:pPr>
+      <w:r>
+        <w:rPr>
+          <w:rFonts w:ascii="Times New Roman" w:hAnsi="Times New Roman"/>
+          <w:sz w:val="22"/>
+        </w:rPr>
+        <w:t>| Multissetorial | Funciona em bancos, saúde, educação, comércio e governo com um único sistema |</w:t>
+      </w:r>
+    </w:p>
+    <w:p>
+      <w:pPr>
+        <w:spacing w:line="320" w:lineRule="exact" w:after="80"/>
+      </w:pPr>
+      <w:r>
+        <w:rPr>
+          <w:rFonts w:ascii="Times New Roman" w:hAnsi="Times New Roman"/>
+          <w:sz w:val="22"/>
+        </w:rPr>
+        <w:t>| Dados Analíticos | Gestores obtêm relatórios de fluxo, horários de pico, tempo médio de espera e desempenho |</w:t>
+      </w:r>
+    </w:p>
+    <w:p>
+      <w:pPr>
+        <w:spacing w:line="320" w:lineRule="exact" w:after="80"/>
+      </w:pPr>
+      <w:r>
+        <w:rPr>
+          <w:rFonts w:ascii="Times New Roman" w:hAnsi="Times New Roman"/>
+          <w:sz w:val="22"/>
+        </w:rPr>
+        <w:t>| Acessibilidade | Modos para baixa visão, alto contraste, surdos (alertas visuais) e TEA (baixo estímulo) |</w:t>
+      </w:r>
+    </w:p>
+    <w:p>
+      <w:pPr>
+        <w:spacing w:line="320" w:lineRule="exact" w:after="80"/>
+      </w:pPr>
+      <w:r>
+        <w:rPr>
+          <w:rFonts w:ascii="Times New Roman" w:hAnsi="Times New Roman"/>
+          <w:sz w:val="22"/>
+        </w:rPr>
+        <w:t>| Baixa Fricção | Cadastro rápido sem burocracia; QR Code elimina necessidade de digitar URLs |</w:t>
+      </w:r>
+    </w:p>
+    <w:p>
+      <w:pPr>
+        <w:spacing w:line="320" w:lineRule="exact" w:after="80"/>
+      </w:pPr>
+      <w:r>
+        <w:rPr>
+          <w:rFonts w:ascii="Times New Roman" w:hAnsi="Times New Roman"/>
+          <w:sz w:val="22"/>
+        </w:rPr>
+        <w:t>## 5. Funcionalidades Principais</w:t>
+      </w:r>
+    </w:p>
+    <w:p>
+      <w:pPr>
+        <w:spacing w:line="320" w:lineRule="exact" w:after="80"/>
+      </w:pPr>
+      <w:r>
+        <w:rPr>
+          <w:rFonts w:ascii="Times New Roman" w:hAnsi="Times New Roman"/>
+          <w:sz w:val="22"/>
+        </w:rPr>
+        <w:t>### Módulo Usuário</w:t>
+      </w:r>
+    </w:p>
+    <w:p>
+      <w:pPr>
+        <w:spacing w:line="320" w:lineRule="exact" w:after="80"/>
+      </w:pPr>
+      <w:r>
+        <w:rPr>
+          <w:rFonts w:ascii="Times New Roman" w:hAnsi="Times New Roman"/>
+          <w:sz w:val="22"/>
+        </w:rPr>
+        <w:t>| Funcionalidade | Descrição |</w:t>
+      </w:r>
+    </w:p>
+    <w:p>
+      <w:pPr>
+        <w:spacing w:line="320" w:lineRule="exact" w:after="80"/>
+      </w:pPr>
+      <w:r>
+        <w:rPr>
+          <w:rFonts w:ascii="Times New Roman" w:hAnsi="Times New Roman"/>
+          <w:sz w:val="22"/>
+        </w:rPr>
+        <w:t>|----------------|-----------|</w:t>
+      </w:r>
+    </w:p>
+    <w:p>
+      <w:pPr>
+        <w:spacing w:line="320" w:lineRule="exact" w:after="80"/>
+      </w:pPr>
+      <w:r>
+        <w:rPr>
+          <w:rFonts w:ascii="Times New Roman" w:hAnsi="Times New Roman"/>
+          <w:sz w:val="22"/>
+        </w:rPr>
+        <w:t>| Cadastro rápido | Nome, telefone, serviço desejado e preferências de acessibilidade |</w:t>
+      </w:r>
+    </w:p>
+    <w:p>
+      <w:pPr>
+        <w:spacing w:line="320" w:lineRule="exact" w:after="80"/>
+      </w:pPr>
+      <w:r>
+        <w:rPr>
+          <w:rFonts w:ascii="Times New Roman" w:hAnsi="Times New Roman"/>
+          <w:sz w:val="22"/>
+        </w:rPr>
+        <w:t>| Senha virtual | Geração automática de senha ao entrar na fila |</w:t>
+      </w:r>
+    </w:p>
+    <w:p>
+      <w:pPr>
+        <w:spacing w:line="320" w:lineRule="exact" w:after="80"/>
+      </w:pPr>
+      <w:r>
+        <w:rPr>
+          <w:rFonts w:ascii="Times New Roman" w:hAnsi="Times New Roman"/>
+          <w:sz w:val="22"/>
+        </w:rPr>
+        <w:t>| Acompanhamento em tempo real | Posição atualizada, tempo estimado, pessoas à frente |</w:t>
+      </w:r>
+    </w:p>
+    <w:p>
+      <w:pPr>
+        <w:spacing w:line="320" w:lineRule="exact" w:after="80"/>
+      </w:pPr>
+      <w:r>
+        <w:rPr>
+          <w:rFonts w:ascii="Times New Roman" w:hAnsi="Times New Roman"/>
+          <w:sz w:val="22"/>
+        </w:rPr>
+        <w:t>| Notificação push | Alerta quando faltar 2-3 pessoas para ser chamado |</w:t>
+      </w:r>
+    </w:p>
+    <w:p>
+      <w:pPr>
+        <w:spacing w:line="320" w:lineRule="exact" w:after="80"/>
+      </w:pPr>
+      <w:r>
+        <w:rPr>
+          <w:rFonts w:ascii="Times New Roman" w:hAnsi="Times New Roman"/>
+          <w:sz w:val="22"/>
+        </w:rPr>
+        <w:t>| Histórico | Consulta de atendimentos anteriores |</w:t>
+      </w:r>
+    </w:p>
+    <w:p>
+      <w:pPr>
+        <w:spacing w:line="320" w:lineRule="exact" w:after="80"/>
+      </w:pPr>
+      <w:r>
+        <w:rPr>
+          <w:rFonts w:ascii="Times New Roman" w:hAnsi="Times New Roman"/>
+          <w:sz w:val="22"/>
+        </w:rPr>
+        <w:t>| Perfil de acessibilidade | Configurações de alto contraste, fonte ampliada, modo silencioso |</w:t>
+      </w:r>
+    </w:p>
+    <w:p>
+      <w:pPr>
+        <w:spacing w:line="320" w:lineRule="exact" w:after="80"/>
+      </w:pPr>
+      <w:r>
+        <w:rPr>
+          <w:rFonts w:ascii="Times New Roman" w:hAnsi="Times New Roman"/>
+          <w:sz w:val="22"/>
+        </w:rPr>
+        <w:t>### Módulo Gestor</w:t>
+      </w:r>
+    </w:p>
+    <w:p>
+      <w:pPr>
+        <w:spacing w:line="320" w:lineRule="exact" w:after="80"/>
+      </w:pPr>
+      <w:r>
+        <w:rPr>
+          <w:rFonts w:ascii="Times New Roman" w:hAnsi="Times New Roman"/>
+          <w:sz w:val="22"/>
+        </w:rPr>
+        <w:t>| Funcionalidade | Descrição |</w:t>
+      </w:r>
+    </w:p>
+    <w:p>
+      <w:pPr>
+        <w:spacing w:line="320" w:lineRule="exact" w:after="80"/>
+      </w:pPr>
+      <w:r>
+        <w:rPr>
+          <w:rFonts w:ascii="Times New Roman" w:hAnsi="Times New Roman"/>
+          <w:sz w:val="22"/>
+        </w:rPr>
+        <w:t>|----------------|-----------|</w:t>
+      </w:r>
+    </w:p>
+    <w:p>
+      <w:pPr>
+        <w:spacing w:line="320" w:lineRule="exact" w:after="80"/>
+      </w:pPr>
+      <w:r>
+        <w:rPr>
+          <w:rFonts w:ascii="Times New Roman" w:hAnsi="Times New Roman"/>
+          <w:sz w:val="22"/>
+        </w:rPr>
+        <w:t>| Painel de fila | Visualização completa das senhas ativas por serviço/guichê |</w:t>
+      </w:r>
+    </w:p>
+    <w:p>
+      <w:pPr>
+        <w:spacing w:line="320" w:lineRule="exact" w:after="80"/>
+      </w:pPr>
+      <w:r>
+        <w:rPr>
+          <w:rFonts w:ascii="Times New Roman" w:hAnsi="Times New Roman"/>
+          <w:sz w:val="22"/>
+        </w:rPr>
+        <w:t>| Chamada | Botão para chamar próximo usuário |</w:t>
+      </w:r>
+    </w:p>
+    <w:p>
+      <w:pPr>
+        <w:spacing w:line="320" w:lineRule="exact" w:after="80"/>
+      </w:pPr>
+      <w:r>
+        <w:rPr>
+          <w:rFonts w:ascii="Times New Roman" w:hAnsi="Times New Roman"/>
+          <w:sz w:val="22"/>
+        </w:rPr>
+        <w:t>| Gestão de guichês | Abrir/fechar guichês, alocar servidores |</w:t>
+      </w:r>
+    </w:p>
+    <w:p>
+      <w:pPr>
+        <w:spacing w:line="320" w:lineRule="exact" w:after="80"/>
+      </w:pPr>
+      <w:r>
+        <w:rPr>
+          <w:rFonts w:ascii="Times New Roman" w:hAnsi="Times New Roman"/>
+          <w:sz w:val="22"/>
+        </w:rPr>
+        <w:t>| Relatórios | Tempo médio de espera, horários de pico, volume por período |</w:t>
+      </w:r>
+    </w:p>
+    <w:p>
+      <w:pPr>
+        <w:spacing w:line="320" w:lineRule="exact" w:after="80"/>
+      </w:pPr>
+      <w:r>
+        <w:rPr>
+          <w:rFonts w:ascii="Times New Roman" w:hAnsi="Times New Roman"/>
+          <w:sz w:val="22"/>
+        </w:rPr>
+        <w:t>| Configurações | Regras de prioridade, capacidade, categorias de serviço |</w:t>
+      </w:r>
+    </w:p>
+    <w:p>
+      <w:pPr>
+        <w:spacing w:line="320" w:lineRule="exact" w:after="80"/>
+      </w:pPr>
+      <w:r>
+        <w:rPr>
+          <w:rFonts w:ascii="Times New Roman" w:hAnsi="Times New Roman"/>
+          <w:sz w:val="22"/>
+        </w:rPr>
+        <w:t>### Módulo Painel Público (TV)</w:t>
+      </w:r>
+    </w:p>
+    <w:p>
+      <w:pPr>
+        <w:spacing w:line="320" w:lineRule="exact" w:after="80"/>
+      </w:pPr>
+      <w:r>
+        <w:rPr>
+          <w:rFonts w:ascii="Times New Roman" w:hAnsi="Times New Roman"/>
+          <w:sz w:val="22"/>
+        </w:rPr>
+        <w:t>| Funcionalidade | Descrição |</w:t>
+      </w:r>
+    </w:p>
+    <w:p>
+      <w:pPr>
+        <w:spacing w:line="320" w:lineRule="exact" w:after="80"/>
+      </w:pPr>
+      <w:r>
+        <w:rPr>
+          <w:rFonts w:ascii="Times New Roman" w:hAnsi="Times New Roman"/>
+          <w:sz w:val="22"/>
+        </w:rPr>
+        <w:t>|----------------|-----------|</w:t>
+      </w:r>
+    </w:p>
+    <w:p>
+      <w:pPr>
+        <w:spacing w:line="320" w:lineRule="exact" w:after="80"/>
+      </w:pPr>
+      <w:r>
+        <w:rPr>
+          <w:rFonts w:ascii="Times New Roman" w:hAnsi="Times New Roman"/>
+          <w:sz w:val="22"/>
+        </w:rPr>
+        <w:t>| Senha do momento | Exibe a senha sendo chamada no guichê |</w:t>
+      </w:r>
+    </w:p>
+    <w:p>
+      <w:pPr>
+        <w:spacing w:line="320" w:lineRule="exact" w:after="80"/>
+      </w:pPr>
+      <w:r>
+        <w:rPr>
+          <w:rFonts w:ascii="Times New Roman" w:hAnsi="Times New Roman"/>
+          <w:sz w:val="22"/>
+        </w:rPr>
+        <w:t>| Próximas senhas | Lista das próximas 5-10 senhas previstas |</w:t>
+      </w:r>
+    </w:p>
+    <w:p>
+      <w:pPr>
+        <w:spacing w:line="320" w:lineRule="exact" w:after="80"/>
+      </w:pPr>
+      <w:r>
+        <w:rPr>
+          <w:rFonts w:ascii="Times New Roman" w:hAnsi="Times New Roman"/>
+          <w:sz w:val="22"/>
+        </w:rPr>
+        <w:t>| Informações complementares | Horário, avisos institucionais |</w:t>
+      </w:r>
+    </w:p>
+    <w:p>
+      <w:pPr>
+        <w:spacing w:line="320" w:lineRule="exact" w:after="80"/>
+      </w:pPr>
+      <w:r>
+        <w:rPr>
+          <w:rFonts w:ascii="Times New Roman" w:hAnsi="Times New Roman"/>
+          <w:sz w:val="22"/>
+        </w:rPr>
+        <w:t>## 6. Fluxos do Sistema</w:t>
+      </w:r>
+    </w:p>
+    <w:p>
+      <w:pPr>
+        <w:spacing w:line="320" w:lineRule="exact" w:after="80"/>
+      </w:pPr>
+      <w:r>
+        <w:rPr>
+          <w:rFonts w:ascii="Times New Roman" w:hAnsi="Times New Roman"/>
+          <w:sz w:val="22"/>
+        </w:rPr>
+        <w:t>### Fluxo Principal (Usuário)</w:t>
+      </w:r>
+    </w:p>
+    <w:p>
+      <w:pPr>
+        <w:spacing w:line="320" w:lineRule="exact" w:after="80"/>
+      </w:pPr>
+      <w:r>
+        <w:rPr>
+          <w:rFonts w:ascii="Times New Roman" w:hAnsi="Times New Roman"/>
+          <w:sz w:val="22"/>
+        </w:rPr>
+      </w:r>
+    </w:p>
+    <w:p>
+      <w:pPr>
+        <w:spacing w:line="320" w:lineRule="exact" w:after="80"/>
+      </w:pPr>
+      <w:r>
+        <w:rPr>
+          <w:rFonts w:ascii="Times New Roman" w:hAnsi="Times New Roman"/>
+          <w:sz w:val="22"/>
+        </w:rPr>
+        <w:t>Chegada → Escaneia QR Code / Abre App → Cadastro rápido →</w:t>
+      </w:r>
+    </w:p>
+    <w:p>
+      <w:pPr>
+        <w:spacing w:line="320" w:lineRule="exact" w:after="80"/>
+      </w:pPr>
+      <w:r>
+        <w:rPr>
+          <w:rFonts w:ascii="Times New Roman" w:hAnsi="Times New Roman"/>
+          <w:sz w:val="22"/>
+        </w:rPr>
+        <w:t>Recebe senha virtual → Acompanha fila no celular →</w:t>
+      </w:r>
+    </w:p>
+    <w:p>
+      <w:pPr>
+        <w:spacing w:line="320" w:lineRule="exact" w:after="80"/>
+      </w:pPr>
+      <w:r>
+        <w:rPr>
+          <w:rFonts w:ascii="Times New Roman" w:hAnsi="Times New Roman"/>
+          <w:sz w:val="22"/>
+        </w:rPr>
+        <w:t>Recebe notificação → Vai ao guichê → Atendimento concluído</w:t>
+      </w:r>
+    </w:p>
+    <w:p>
+      <w:pPr>
+        <w:spacing w:line="320" w:lineRule="exact" w:after="80"/>
+      </w:pPr>
+      <w:r>
+        <w:rPr>
+          <w:rFonts w:ascii="Times New Roman" w:hAnsi="Times New Roman"/>
+          <w:sz w:val="22"/>
+        </w:rPr>
+      </w:r>
+    </w:p>
+    <w:p>
+      <w:pPr>
+        <w:spacing w:line="320" w:lineRule="exact" w:after="80"/>
+      </w:pPr>
+      <w:r>
+        <w:rPr>
+          <w:rFonts w:ascii="Times New Roman" w:hAnsi="Times New Roman"/>
+          <w:sz w:val="22"/>
+        </w:rPr>
+        <w:t>### Fluxo de Gestão</w:t>
+      </w:r>
+    </w:p>
+    <w:p>
+      <w:pPr>
+        <w:spacing w:line="320" w:lineRule="exact" w:after="80"/>
+      </w:pPr>
+      <w:r>
+        <w:rPr>
+          <w:rFonts w:ascii="Times New Roman" w:hAnsi="Times New Roman"/>
+          <w:sz w:val="22"/>
+        </w:rPr>
+      </w:r>
+    </w:p>
+    <w:p>
+      <w:pPr>
+        <w:spacing w:line="320" w:lineRule="exact" w:after="80"/>
+      </w:pPr>
+      <w:r>
+        <w:rPr>
+          <w:rFonts w:ascii="Times New Roman" w:hAnsi="Times New Roman"/>
+          <w:sz w:val="22"/>
+        </w:rPr>
+        <w:t>Abre painel → Visualiza fila atual → Chama próximo →</w:t>
+      </w:r>
+    </w:p>
+    <w:p>
+      <w:pPr>
+        <w:spacing w:line="320" w:lineRule="exact" w:after="80"/>
+      </w:pPr>
+      <w:r>
+        <w:rPr>
+          <w:rFonts w:ascii="Times New Roman" w:hAnsi="Times New Roman"/>
+          <w:sz w:val="22"/>
+        </w:rPr>
+        <w:t>Usuário é notificado → Usuário chega ao guichê →</w:t>
+      </w:r>
+    </w:p>
+    <w:p>
+      <w:pPr>
+        <w:spacing w:line="320" w:lineRule="exact" w:after="80"/>
+      </w:pPr>
+      <w:r>
+        <w:rPr>
+          <w:rFonts w:ascii="Times New Roman" w:hAnsi="Times New Roman"/>
+          <w:sz w:val="22"/>
+        </w:rPr>
+        <w:t>Registra atendimento → Fila atualiza automaticamente</w:t>
+      </w:r>
+    </w:p>
+    <w:p>
+      <w:pPr>
+        <w:spacing w:line="320" w:lineRule="exact" w:after="80"/>
+      </w:pPr>
+      <w:r>
+        <w:rPr>
+          <w:rFonts w:ascii="Times New Roman" w:hAnsi="Times New Roman"/>
+          <w:sz w:val="22"/>
+        </w:rPr>
+      </w:r>
+    </w:p>
+    <w:p>
+      <w:pPr>
+        <w:spacing w:line="320" w:lineRule="exact" w:after="80"/>
+      </w:pPr>
+      <w:r>
+        <w:rPr>
+          <w:rFonts w:ascii="Times New Roman" w:hAnsi="Times New Roman"/>
+          <w:sz w:val="22"/>
+        </w:rPr>
+        <w:t>### Fluxo de Saída Temporária</w:t>
+      </w:r>
+    </w:p>
+    <w:p>
+      <w:pPr>
+        <w:spacing w:line="320" w:lineRule="exact" w:after="80"/>
+      </w:pPr>
+      <w:r>
+        <w:rPr>
+          <w:rFonts w:ascii="Times New Roman" w:hAnsi="Times New Roman"/>
+          <w:sz w:val="22"/>
+        </w:rPr>
+      </w:r>
+    </w:p>
+    <w:p>
+      <w:pPr>
+        <w:spacing w:line="320" w:lineRule="exact" w:after="80"/>
+      </w:pPr>
+      <w:r>
+        <w:rPr>
+          <w:rFonts w:ascii="Times New Roman" w:hAnsi="Times New Roman"/>
+          <w:sz w:val="22"/>
+        </w:rPr>
+        <w:t>Usuário marca "Vou sair um pouco" → App continua monitorando →</w:t>
+      </w:r>
+    </w:p>
+    <w:p>
+      <w:pPr>
+        <w:spacing w:line="320" w:lineRule="exact" w:after="80"/>
+      </w:pPr>
+      <w:r>
+        <w:rPr>
+          <w:rFonts w:ascii="Times New Roman" w:hAnsi="Times New Roman"/>
+          <w:sz w:val="22"/>
+        </w:rPr>
+        <w:t>Quando faltarem 2 pessoas → Notificação push →</w:t>
+      </w:r>
+    </w:p>
+    <w:p>
+      <w:pPr>
+        <w:spacing w:line="320" w:lineRule="exact" w:after="80"/>
+      </w:pPr>
+      <w:r>
+        <w:rPr>
+          <w:rFonts w:ascii="Times New Roman" w:hAnsi="Times New Roman"/>
+          <w:sz w:val="22"/>
+        </w:rPr>
+        <w:t>Usuário retorna → É chamado normalmente</w:t>
+      </w:r>
+    </w:p>
+    <w:p>
+      <w:pPr>
+        <w:spacing w:line="320" w:lineRule="exact" w:after="80"/>
+      </w:pPr>
+      <w:r>
+        <w:rPr>
+          <w:rFonts w:ascii="Times New Roman" w:hAnsi="Times New Roman"/>
+          <w:sz w:val="22"/>
+        </w:rPr>
+      </w:r>
+    </w:p>
+    <w:p>
+      <w:pPr>
+        <w:spacing w:line="320" w:lineRule="exact" w:after="80"/>
+      </w:pPr>
+      <w:r>
+        <w:rPr>
+          <w:rFonts w:ascii="Times New Roman" w:hAnsi="Times New Roman"/>
+          <w:sz w:val="22"/>
+        </w:rPr>
+        <w:t>## 7. Mapa de Telas</w:t>
+      </w:r>
+    </w:p>
+    <w:p>
+      <w:pPr>
+        <w:spacing w:line="320" w:lineRule="exact" w:after="80"/>
+      </w:pPr>
+      <w:r>
+        <w:rPr>
+          <w:rFonts w:ascii="Times New Roman" w:hAnsi="Times New Roman"/>
+          <w:sz w:val="22"/>
+        </w:rPr>
+        <w:t>### App do Usuário</w:t>
+      </w:r>
+    </w:p>
+    <w:p>
+      <w:pPr>
+        <w:spacing w:line="320" w:lineRule="exact" w:after="80"/>
+      </w:pPr>
+      <w:r>
+        <w:rPr>
+          <w:rFonts w:ascii="Times New Roman" w:hAnsi="Times New Roman"/>
+          <w:sz w:val="22"/>
+        </w:rPr>
+        <w:t>1. Tela de Boas-vindas / QR Code Scanner</w:t>
+      </w:r>
+    </w:p>
+    <w:p>
+      <w:pPr>
+        <w:spacing w:line="320" w:lineRule="exact" w:after="80"/>
+      </w:pPr>
+      <w:r>
+        <w:rPr>
+          <w:rFonts w:ascii="Times New Roman" w:hAnsi="Times New Roman"/>
+          <w:sz w:val="22"/>
+        </w:rPr>
+        <w:t>2. Cadastro Rápido (nome, telefone, serviço)</w:t>
+      </w:r>
+    </w:p>
+    <w:p>
+      <w:pPr>
+        <w:spacing w:line="320" w:lineRule="exact" w:after="80"/>
+      </w:pPr>
+      <w:r>
+        <w:rPr>
+          <w:rFonts w:ascii="Times New Roman" w:hAnsi="Times New Roman"/>
+          <w:sz w:val="22"/>
+        </w:rPr>
+        <w:t>3. Minha Fila (posição, tempo estimado, status)</w:t>
+      </w:r>
+    </w:p>
+    <w:p>
+      <w:pPr>
+        <w:spacing w:line="320" w:lineRule="exact" w:after="80"/>
+      </w:pPr>
+      <w:r>
+        <w:rPr>
+          <w:rFonts w:ascii="Times New Roman" w:hAnsi="Times New Roman"/>
+          <w:sz w:val="22"/>
+        </w:rPr>
+        <w:t>4. Detalhes da Fila (pessoas à frente por categoria)</w:t>
+      </w:r>
+    </w:p>
+    <w:p>
+      <w:pPr>
+        <w:spacing w:line="320" w:lineRule="exact" w:after="80"/>
+      </w:pPr>
+      <w:r>
+        <w:rPr>
+          <w:rFonts w:ascii="Times New Roman" w:hAnsi="Times New Roman"/>
+          <w:sz w:val="22"/>
+        </w:rPr>
+        <w:t>5. Notificação / Alerta de Chamada</w:t>
+      </w:r>
+    </w:p>
+    <w:p>
+      <w:pPr>
+        <w:spacing w:line="320" w:lineRule="exact" w:after="80"/>
+      </w:pPr>
+      <w:r>
+        <w:rPr>
+          <w:rFonts w:ascii="Times New Roman" w:hAnsi="Times New Roman"/>
+          <w:sz w:val="22"/>
+        </w:rPr>
+        <w:t>6. Histórico de Atendimentos</w:t>
+      </w:r>
+    </w:p>
+    <w:p>
+      <w:pPr>
+        <w:spacing w:line="320" w:lineRule="exact" w:after="80"/>
+      </w:pPr>
+      <w:r>
+        <w:rPr>
+          <w:rFonts w:ascii="Times New Roman" w:hAnsi="Times New Roman"/>
+          <w:sz w:val="22"/>
+        </w:rPr>
+        <w:t>7. Configurações de Acessibilidade</w:t>
+      </w:r>
+    </w:p>
+    <w:p>
+      <w:pPr>
+        <w:spacing w:line="320" w:lineRule="exact" w:after="80"/>
+      </w:pPr>
+      <w:r>
+        <w:rPr>
+          <w:rFonts w:ascii="Times New Roman" w:hAnsi="Times New Roman"/>
+          <w:sz w:val="22"/>
+        </w:rPr>
+        <w:t>### Painel Web do Gestor</w:t>
+      </w:r>
+    </w:p>
+    <w:p>
+      <w:pPr>
+        <w:spacing w:line="320" w:lineRule="exact" w:after="80"/>
+      </w:pPr>
+      <w:r>
+        <w:rPr>
+          <w:rFonts w:ascii="Times New Roman" w:hAnsi="Times New Roman"/>
+          <w:sz w:val="22"/>
+        </w:rPr>
+        <w:t>1. Dashboard (fila ativa, guichês, métricas em tempo real)</w:t>
+      </w:r>
+    </w:p>
+    <w:p>
+      <w:pPr>
+        <w:spacing w:line="320" w:lineRule="exact" w:after="80"/>
+      </w:pPr>
+      <w:r>
+        <w:rPr>
+          <w:rFonts w:ascii="Times New Roman" w:hAnsi="Times New Roman"/>
+          <w:sz w:val="22"/>
+        </w:rPr>
+        <w:t>2. Gestão de Guichês (abrir/fechar, alocar)</w:t>
+      </w:r>
+    </w:p>
+    <w:p>
+      <w:pPr>
+        <w:spacing w:line="320" w:lineRule="exact" w:after="80"/>
+      </w:pPr>
+      <w:r>
+        <w:rPr>
+          <w:rFonts w:ascii="Times New Roman" w:hAnsi="Times New Roman"/>
+          <w:sz w:val="22"/>
+        </w:rPr>
+        <w:t>3. Relatórios (tempo médio, picos, histórico)</w:t>
+      </w:r>
+    </w:p>
+    <w:p>
+      <w:pPr>
+        <w:spacing w:line="320" w:lineRule="exact" w:after="80"/>
+      </w:pPr>
+      <w:r>
+        <w:rPr>
+          <w:rFonts w:ascii="Times New Roman" w:hAnsi="Times New Roman"/>
+          <w:sz w:val="22"/>
+        </w:rPr>
+        <w:t>4. Configurações do Estabelecimento</w:t>
+      </w:r>
+    </w:p>
+    <w:p>
+      <w:pPr>
+        <w:spacing w:line="320" w:lineRule="exact" w:after="80"/>
+      </w:pPr>
+      <w:r>
+        <w:rPr>
+          <w:rFonts w:ascii="Times New Roman" w:hAnsi="Times New Roman"/>
+          <w:sz w:val="22"/>
+        </w:rPr>
+        <w:t>### Painel para TV</w:t>
+      </w:r>
+    </w:p>
+    <w:p>
+      <w:pPr>
+        <w:spacing w:line="320" w:lineRule="exact" w:after="80"/>
+      </w:pPr>
+      <w:r>
+        <w:rPr>
+          <w:rFonts w:ascii="Times New Roman" w:hAnsi="Times New Roman"/>
+          <w:sz w:val="22"/>
+        </w:rPr>
+        <w:t>1. Tela de Chamada (senha atual + guichê)</w:t>
+      </w:r>
+    </w:p>
+    <w:p>
+      <w:pPr>
+        <w:spacing w:line="320" w:lineRule="exact" w:after="80"/>
+      </w:pPr>
+      <w:r>
+        <w:rPr>
+          <w:rFonts w:ascii="Times New Roman" w:hAnsi="Times New Roman"/>
+          <w:sz w:val="22"/>
+        </w:rPr>
+        <w:t>2. Lista de Próximas Chamadas</w:t>
+      </w:r>
+    </w:p>
+    <w:p>
+      <w:pPr>
+        <w:spacing w:line="320" w:lineRule="exact" w:after="80"/>
+      </w:pPr>
+      <w:r>
+        <w:rPr>
+          <w:rFonts w:ascii="Times New Roman" w:hAnsi="Times New Roman"/>
+          <w:sz w:val="22"/>
+        </w:rPr>
+        <w:t>## 8. Arquitetura Tecnológica</w:t>
+      </w:r>
+    </w:p>
+    <w:p>
+      <w:pPr>
+        <w:spacing w:line="320" w:lineRule="exact" w:after="80"/>
+      </w:pPr>
+      <w:r>
+        <w:rPr>
+          <w:rFonts w:ascii="Times New Roman" w:hAnsi="Times New Roman"/>
+          <w:sz w:val="22"/>
+        </w:rPr>
+        <w:t>| Componente | Tecnologia |</w:t>
+      </w:r>
+    </w:p>
+    <w:p>
+      <w:pPr>
+        <w:spacing w:line="320" w:lineRule="exact" w:after="80"/>
+      </w:pPr>
+      <w:r>
+        <w:rPr>
+          <w:rFonts w:ascii="Times New Roman" w:hAnsi="Times New Roman"/>
+          <w:sz w:val="22"/>
+        </w:rPr>
+        <w:t>|------------|------------|</w:t>
+      </w:r>
+    </w:p>
+    <w:p>
+      <w:pPr>
+        <w:spacing w:line="320" w:lineRule="exact" w:after="80"/>
+      </w:pPr>
+      <w:r>
+        <w:rPr>
+          <w:rFonts w:ascii="Times New Roman" w:hAnsi="Times New Roman"/>
+          <w:sz w:val="22"/>
+        </w:rPr>
+        <w:t>| Frontend (usuário) | Web responsivo com tecnologia PWA (instalável como app) |</w:t>
+      </w:r>
+    </w:p>
+    <w:p>
+      <w:pPr>
+        <w:spacing w:line="320" w:lineRule="exact" w:after="80"/>
+      </w:pPr>
+      <w:r>
+        <w:rPr>
+          <w:rFonts w:ascii="Times New Roman" w:hAnsi="Times New Roman"/>
+          <w:sz w:val="22"/>
+        </w:rPr>
+        <w:t>| Frontend (gestor) | Dashboard web responsivo |</w:t>
+      </w:r>
+    </w:p>
+    <w:p>
+      <w:pPr>
+        <w:spacing w:line="320" w:lineRule="exact" w:after="80"/>
+      </w:pPr>
+      <w:r>
+        <w:rPr>
+          <w:rFonts w:ascii="Times New Roman" w:hAnsi="Times New Roman"/>
+          <w:sz w:val="22"/>
+        </w:rPr>
+        <w:t>| Painel TV | Página web otimizada para telas grandes |</w:t>
+      </w:r>
+    </w:p>
+    <w:p>
+      <w:pPr>
+        <w:spacing w:line="320" w:lineRule="exact" w:after="80"/>
+      </w:pPr>
+      <w:r>
+        <w:rPr>
+          <w:rFonts w:ascii="Times New Roman" w:hAnsi="Times New Roman"/>
+          <w:sz w:val="22"/>
+        </w:rPr>
+        <w:t>| Backend | API REST |</w:t>
+      </w:r>
+    </w:p>
+    <w:p>
+      <w:pPr>
+        <w:spacing w:line="320" w:lineRule="exact" w:after="80"/>
+      </w:pPr>
+      <w:r>
+        <w:rPr>
+          <w:rFonts w:ascii="Times New Roman" w:hAnsi="Times New Roman"/>
+          <w:sz w:val="22"/>
+        </w:rPr>
+        <w:t>| Notificações | Push notification via Service Worker (PWA) |</w:t>
+      </w:r>
+    </w:p>
+    <w:p>
+      <w:pPr>
+        <w:spacing w:line="320" w:lineRule="exact" w:after="80"/>
+      </w:pPr>
+      <w:r>
+        <w:rPr>
+          <w:rFonts w:ascii="Times New Roman" w:hAnsi="Times New Roman"/>
+          <w:sz w:val="22"/>
+        </w:rPr>
+        <w:t>| Identificação | QR Code estático por estabelecimento + código único por senha |</w:t>
+      </w:r>
+    </w:p>
+    <w:p>
+      <w:pPr>
+        <w:spacing w:line="320" w:lineRule="exact" w:after="80"/>
+      </w:pPr>
+      <w:r>
+        <w:rPr>
+          <w:rFonts w:ascii="Times New Roman" w:hAnsi="Times New Roman"/>
+          <w:sz w:val="22"/>
+        </w:rPr>
+        <w:t>| Banco de Dados | Relacional (estrutura de fila, usuários, estabelecimentos, atendimentos) |</w:t>
+      </w:r>
+    </w:p>
+    <w:p>
+      <w:pPr>
+        <w:spacing w:line="320" w:lineRule="exact" w:after="80"/>
+      </w:pPr>
+      <w:r>
+        <w:rPr>
+          <w:rFonts w:ascii="Times New Roman" w:hAnsi="Times New Roman"/>
+          <w:sz w:val="22"/>
+        </w:rPr>
+        <w:t>## 9. Casos de Uso por Setor</w:t>
+      </w:r>
+    </w:p>
+    <w:p>
+      <w:pPr>
+        <w:spacing w:line="320" w:lineRule="exact" w:after="80"/>
+      </w:pPr>
+      <w:r>
+        <w:rPr>
+          <w:rFonts w:ascii="Times New Roman" w:hAnsi="Times New Roman"/>
+          <w:sz w:val="22"/>
+        </w:rPr>
+        <w:t>| Setor | Exemplo de Uso |</w:t>
+      </w:r>
+    </w:p>
+    <w:p>
+      <w:pPr>
+        <w:spacing w:line="320" w:lineRule="exact" w:after="80"/>
+      </w:pPr>
+      <w:r>
+        <w:rPr>
+          <w:rFonts w:ascii="Times New Roman" w:hAnsi="Times New Roman"/>
+          <w:sz w:val="22"/>
+        </w:rPr>
+        <w:t>|-------|---------------|</w:t>
+      </w:r>
+    </w:p>
+    <w:p>
+      <w:pPr>
+        <w:spacing w:line="320" w:lineRule="exact" w:after="80"/>
+      </w:pPr>
+      <w:r>
+        <w:rPr>
+          <w:rFonts w:ascii="Times New Roman" w:hAnsi="Times New Roman"/>
+          <w:sz w:val="22"/>
+        </w:rPr>
+        <w:t>| Bancos | Senha para caixa, gerente, serviços específicos (abertura de conta, cartão) |</w:t>
+      </w:r>
+    </w:p>
+    <w:p>
+      <w:pPr>
+        <w:spacing w:line="320" w:lineRule="exact" w:after="80"/>
+      </w:pPr>
+      <w:r>
+        <w:rPr>
+          <w:rFonts w:ascii="Times New Roman" w:hAnsi="Times New Roman"/>
+          <w:sz w:val="22"/>
+        </w:rPr>
+        <w:t>| Saúde | Chegada na recepção, aguardo de consulta, exames, retornos |</w:t>
+      </w:r>
+    </w:p>
+    <w:p>
+      <w:pPr>
+        <w:spacing w:line="320" w:lineRule="exact" w:after="80"/>
+      </w:pPr>
+      <w:r>
+        <w:rPr>
+          <w:rFonts w:ascii="Times New Roman" w:hAnsi="Times New Roman"/>
+          <w:sz w:val="22"/>
+        </w:rPr>
+        <w:t>| Educação | Matrícula, secretaria, atendimento ao aluno, protocolo |</w:t>
+      </w:r>
+    </w:p>
+    <w:p>
+      <w:pPr>
+        <w:spacing w:line="320" w:lineRule="exact" w:after="80"/>
+      </w:pPr>
+      <w:r>
+        <w:rPr>
+          <w:rFonts w:ascii="Times New Roman" w:hAnsi="Times New Roman"/>
+          <w:sz w:val="22"/>
+        </w:rPr>
+        <w:t>| Comércio | Atendimento prioritário, retirada de pedidos, SAC |</w:t>
+      </w:r>
+    </w:p>
+    <w:p>
+      <w:pPr>
+        <w:spacing w:line="320" w:lineRule="exact" w:after="80"/>
+      </w:pPr>
+      <w:r>
+        <w:rPr>
+          <w:rFonts w:ascii="Times New Roman" w:hAnsi="Times New Roman"/>
+          <w:sz w:val="22"/>
+        </w:rPr>
+        <w:t>| Governo | Protocolo, atendimento presencial, serviços públicos |</w:t>
+      </w:r>
+    </w:p>
+    <w:p>
+      <w:pPr>
+        <w:spacing w:line="320" w:lineRule="exact" w:after="80"/>
+      </w:pPr>
+      <w:r>
+        <w:rPr>
+          <w:rFonts w:ascii="Times New Roman" w:hAnsi="Times New Roman"/>
+          <w:sz w:val="22"/>
+        </w:rPr>
+        <w:t>## 10. Próximos Passos</w:t>
+      </w:r>
+    </w:p>
+    <w:p>
+      <w:pPr>
+        <w:spacing w:line="320" w:lineRule="exact" w:after="80"/>
+      </w:pPr>
+      <w:r>
+        <w:rPr>
+          <w:rFonts w:ascii="Times New Roman" w:hAnsi="Times New Roman"/>
+          <w:sz w:val="22"/>
+        </w:rPr>
+        <w:t>1. Detalhamento técnico do fluxograma do sistema.</w:t>
+      </w:r>
+    </w:p>
+    <w:p>
+      <w:pPr>
+        <w:spacing w:line="320" w:lineRule="exact" w:after="80"/>
+      </w:pPr>
+      <w:r>
+        <w:rPr>
+          <w:rFonts w:ascii="Times New Roman" w:hAnsi="Times New Roman"/>
+          <w:sz w:val="22"/>
+        </w:rPr>
+        <w:t>2. Prototipação das telas principais (usuário + gestor).</w:t>
+      </w:r>
+    </w:p>
+    <w:p>
+      <w:pPr>
+        <w:spacing w:line="320" w:lineRule="exact" w:after="80"/>
+      </w:pPr>
+      <w:r>
+        <w:rPr>
+          <w:rFonts w:ascii="Times New Roman" w:hAnsi="Times New Roman"/>
+          <w:sz w:val="22"/>
+        </w:rPr>
+        <w:t>3. Definição da identidade visual (cores, tipografia, logotipo).</w:t>
+      </w:r>
+    </w:p>
+    <w:p>
+      <w:pPr>
+        <w:spacing w:line="320" w:lineRule="exact" w:after="80"/>
+      </w:pPr>
+      <w:r>
+        <w:rPr>
+          <w:rFonts w:ascii="Times New Roman" w:hAnsi="Times New Roman"/>
+          <w:sz w:val="22"/>
+        </w:rPr>
+        <w:t>4. Estruturação do banco de dados e API.</w:t>
+      </w:r>
+    </w:p>
+    <w:p>
+      <w:pPr>
+        <w:spacing w:line="320" w:lineRule="exact" w:after="80"/>
+      </w:pPr>
+      <w:r>
+        <w:rPr>
+          <w:rFonts w:ascii="Times New Roman" w:hAnsi="Times New Roman"/>
+          <w:sz w:val="22"/>
+        </w:rPr>
+        <w:t>5. Desenvolvimento do protótipo funcional (PWA).</w:t>
+      </w:r>
+    </w:p>
+    <w:p>
+      <w:pPr>
+        <w:spacing w:line="320" w:lineRule="exact" w:after="80"/>
+      </w:pPr>
+      <w:r>
+        <w:rPr>
+          <w:rFonts w:ascii="Times New Roman" w:hAnsi="Times New Roman"/>
+          <w:sz w:val="22"/>
+        </w:rPr>
+        <w:t>6. Preparação dos slides para apresentação.</w:t>
+      </w:r>
+    </w:p>
+    <w:p>
+      <w:pPr>
+        <w:spacing w:line="320" w:lineRule="exact" w:after="80"/>
+      </w:pPr>
+      <w:r>
+        <w:rPr>
+          <w:rFonts w:ascii="Times New Roman" w:hAnsi="Times New Roman"/>
+          <w:b/>
+          <w:color w:val="006DAA"/>
+          <w:sz w:val="26"/>
+        </w:rPr>
+        <w:t>3.2 Telas de protótipo</w:t>
+      </w:r>
+    </w:p>
+    <w:p>
+      <w:pPr>
+        <w:jc w:val="center"/>
+      </w:pPr>
+      <w:r>
+        <w:rPr>
+          <w:i/>
+          <w:color w:val="808080"/>
+          <w:sz w:val="20"/>
+        </w:rPr>
+        <w:t>(capturas de tela do protótipo serão inseridas aqui — disponível em: https://deivisan.github.io/Metodologia-EAD/minhafila/)</w:t>
+      </w:r>
+    </w:p>
     <w:sectPr>
+      <w:headerReference w:type="default" r:id="rId25"/>
+      <w:footerReference w:type="default" r:id="rId26"/>
       <w:pgSz w:w="11906" w:h="16838"/>
       <w:pgMar w:top="1701" w:right="1134" w:bottom="1134" w:left="1701" w:header="709" w:footer="709" w:gutter="0"/>
       <w:cols w:space="708"/>
@@ -6457,6 +8106,160 @@
     </w:sectPr>
   </w:body>
 </w:document>
+</file>
+
+<file path=word/footer1.xml><?xml version="1.0" encoding="utf-8"?>
+<w:ftr xmlns:m="http://schemas.openxmlformats.org/officeDocument/2006/math" xmlns:mc="http://schemas.openxmlformats.org/markup-compatibility/2006" xmlns:mo="http://schemas.microsoft.com/office/mac/office/2008/main" xmlns:mv="urn:schemas-microsoft-com:mac:vml" xmlns:o="urn:schemas-microsoft-com:office:office" xmlns:r="http://schemas.openxmlformats.org/officeDocument/2006/relationships" xmlns:v="urn:schemas-microsoft-com:vml" xmlns:w10="urn:schemas-microsoft-com:office:word" xmlns:w14="http://schemas.microsoft.com/office/word/2010/wordml" xmlns:w="http://schemas.openxmlformats.org/wordprocessingml/2006/main" xmlns:wne="http://schemas.microsoft.com/office/word/2006/wordml" xmlns:wp14="http://schemas.microsoft.com/office/word/2010/wordprocessingDrawing" xmlns:wp="http://schemas.openxmlformats.org/drawingml/2006/wordprocessingDrawing" xmlns:wpc="http://schemas.microsoft.com/office/word/2010/wordprocessingCanvas" xmlns:wpg="http://schemas.microsoft.com/office/word/2010/wordprocessingGroup" xmlns:wpi="http://schemas.microsoft.com/office/word/2010/wordprocessingInk" xmlns:wps="http://schemas.microsoft.com/office/word/2010/wordprocessingShape" mc:Ignorable="w14 wp14">
+  <w:p>
+    <w:pPr>
+      <w:pStyle w:val="Footer"/>
+      <w:jc w:val="center"/>
+    </w:pPr>
+    <w:r>
+      <w:rPr>
+        <w:rFonts w:ascii="Times New Roman" w:hAnsi="Times New Roman"/>
+        <w:i/>
+        <w:color w:val="505050"/>
+        <w:sz w:val="14"/>
+      </w:rPr>
+      <w:t>MinhaFila — GCETENS843 — 2026.1</w:t>
+    </w:r>
+  </w:p>
+</w:ftr>
+</file>
+
+<file path=word/header1.xml><?xml version="1.0" encoding="utf-8"?>
+<w:hdr xmlns:m="http://schemas.openxmlformats.org/officeDocument/2006/math" xmlns:mc="http://schemas.openxmlformats.org/markup-compatibility/2006" xmlns:mo="http://schemas.microsoft.com/office/mac/office/2008/main" xmlns:mv="urn:schemas-microsoft-com:mac:vml" xmlns:o="urn:schemas-microsoft-com:office:office" xmlns:r="http://schemas.openxmlformats.org/officeDocument/2006/relationships" xmlns:v="urn:schemas-microsoft-com:vml" xmlns:w10="urn:schemas-microsoft-com:office:word" xmlns:w14="http://schemas.microsoft.com/office/word/2010/wordml" xmlns:w="http://schemas.openxmlformats.org/wordprocessingml/2006/main" xmlns:wne="http://schemas.microsoft.com/office/word/2006/wordml" xmlns:wp14="http://schemas.microsoft.com/office/word/2010/wordprocessingDrawing" xmlns:wp="http://schemas.openxmlformats.org/drawingml/2006/wordprocessingDrawing" xmlns:wpc="http://schemas.microsoft.com/office/word/2010/wordprocessingCanvas" xmlns:wpg="http://schemas.microsoft.com/office/word/2010/wordprocessingGroup" xmlns:wpi="http://schemas.microsoft.com/office/word/2010/wordprocessingInk" xmlns:wps="http://schemas.microsoft.com/office/word/2010/wordprocessingShape" mc:Ignorable="w14 wp14">
+  <w:p>
+    <w:pPr>
+      <w:pStyle w:val="Header"/>
+    </w:pPr>
+  </w:p>
+  <w:tbl>
+    <w:tblPr>
+      <w:tblW w:type="auto" w:w="0"/>
+      <w:tblLayout w:type="autofit"/>
+      <w:tblLook w:firstColumn="1" w:firstRow="1" w:lastColumn="0" w:lastRow="0" w:noHBand="0" w:noVBand="1" w:val="04A0"/>
+      <w:tblBorders>
+        <w:top w:val="none" w:sz="0" w:space="0" w:color="auto"/>
+        <w:left w:val="none" w:sz="0" w:space="0" w:color="auto"/>
+        <w:bottom w:val="none" w:sz="0" w:space="0" w:color="auto"/>
+        <w:right w:val="none" w:sz="0" w:space="0" w:color="auto"/>
+      </w:tblBorders>
+    </w:tblPr>
+    <w:tblGrid>
+      <w:gridCol w:w="4680"/>
+      <w:gridCol w:w="4680"/>
+    </w:tblGrid>
+    <w:tr>
+      <w:tc>
+        <w:tcPr>
+          <w:tcW w:type="dxa" w:w="4680"/>
+        </w:tcPr>
+        <w:p>
+          <w:pPr>
+            <w:jc w:val="left"/>
+          </w:pPr>
+          <w:r>
+            <w:drawing>
+              <wp:inline xmlns:a="http://schemas.openxmlformats.org/drawingml/2006/main" xmlns:pic="http://schemas.openxmlformats.org/drawingml/2006/picture">
+                <wp:extent cx="1143000" cy="450211"/>
+                <wp:docPr id="1" name="Picture 1"/>
+                <wp:cNvGraphicFramePr>
+                  <a:graphicFrameLocks noChangeAspect="1"/>
+                </wp:cNvGraphicFramePr>
+                <a:graphic>
+                  <a:graphicData uri="http://schemas.openxmlformats.org/drawingml/2006/picture">
+                    <pic:pic>
+                      <pic:nvPicPr>
+                        <pic:cNvPr id="0" name="logo-ufrb-20-anos.png"/>
+                        <pic:cNvPicPr/>
+                      </pic:nvPicPr>
+                      <pic:blipFill>
+                        <a:blip r:embed="rId1"/>
+                        <a:stretch>
+                          <a:fillRect/>
+                        </a:stretch>
+                      </pic:blipFill>
+                      <pic:spPr>
+                        <a:xfrm>
+                          <a:off x="0" y="0"/>
+                          <a:ext cx="1143000" cy="450211"/>
+                        </a:xfrm>
+                        <a:prstGeom prst="rect"/>
+                      </pic:spPr>
+                    </pic:pic>
+                  </a:graphicData>
+                </a:graphic>
+              </wp:inline>
+            </w:drawing>
+          </w:r>
+        </w:p>
+      </w:tc>
+      <w:tc>
+        <w:tcPr>
+          <w:tcW w:type="dxa" w:w="4680"/>
+        </w:tcPr>
+        <w:p>
+          <w:pPr>
+            <w:jc w:val="left"/>
+          </w:pPr>
+          <w:r>
+            <w:rPr>
+              <w:rFonts w:ascii="Times New Roman" w:hAnsi="Times New Roman"/>
+              <w:b/>
+              <w:color w:val="003D6B"/>
+              <w:sz w:val="16"/>
+            </w:rPr>
+            <w:t>UNIVERSIDADE FEDERAL DO RECÔNCAVO DA BAHIA — UFRB</w:t>
+          </w:r>
+        </w:p>
+        <w:p>
+          <w:pPr>
+            <w:jc w:val="left"/>
+          </w:pPr>
+          <w:r>
+            <w:rPr>
+              <w:rFonts w:ascii="Times New Roman" w:hAnsi="Times New Roman"/>
+              <w:b/>
+              <w:color w:val="006DAA"/>
+              <w:sz w:val="15"/>
+            </w:rPr>
+            <w:t>CENTRO DE CIÊNCIA E TECNOLOGIA — CETENS</w:t>
+          </w:r>
+        </w:p>
+        <w:p>
+          <w:pPr>
+            <w:jc w:val="left"/>
+          </w:pPr>
+          <w:r>
+            <w:rPr>
+              <w:rFonts w:ascii="Times New Roman" w:hAnsi="Times New Roman"/>
+              <w:b w:val="0"/>
+              <w:color w:val="505050"/>
+              <w:sz w:val="14"/>
+            </w:rPr>
+            <w:t>BACHARELADO EM SISTEMAS DE INFORMAÇÃO (EAD)</w:t>
+          </w:r>
+        </w:p>
+        <w:p>
+          <w:pPr>
+            <w:jc w:val="left"/>
+          </w:pPr>
+          <w:r>
+            <w:rPr>
+              <w:rFonts w:ascii="Times New Roman" w:hAnsi="Times New Roman"/>
+              <w:b w:val="0"/>
+              <w:color w:val="C89B3C"/>
+              <w:sz w:val="8"/>
+            </w:rPr>
+            <w:t>────────────────────────────────────────────────────────────────────────────────</w:t>
+          </w:r>
+        </w:p>
+      </w:tc>
+    </w:tr>
+  </w:tbl>
+</w:hdr>
 </file>
 
 <file path=word/styles.xml><?xml version="1.0" encoding="utf-8"?>

</xml_diff>